<commit_message>
new file:   IoT/RM/README.md 	new file:   IoT/RM/README_Version2 (4).md 	new file:   IoT/__pycache__/emergency_system.cpython-310.pyc 	new file:   IoT/__pycache__/intrusion_detection.cpython-310.pyc 	new file:   IoT/emergency_system.py 	new file:   IoT/models/leak_model.pkl 	new file:   IoT/models/smoke_model.pkl 	new file:   IoT/test/__pycache__/generate_sensor_batch.cpython-310.pyc 	new file:   IoT/test/data.csv 	new file:   IoT/test/generate_sensor_batch.py 	new file:   IoT/test/label.csv 	new file:   IoT/test/qt_sensor_generator.py 	new file:   IoT/test/qt_sensor_generator_config.json new file:   IoT/test/run_emergency_tests.py 	new file:   IoT/test/safe_unified_test_clean.csv 	new file:   IoT/test/unified_test_clean.csv 	new file:   IoT/utilites/__pycache__/intrusion_detection.cpython-310.pyc 	new file:   IoT/utilites/cumulants.py new file:   IoT/utilites/fire_test.py 	new file:   IoT/utilites/intrusion_detection.py 	new file:   IoT/utilites/water_test.py
</commit_message>
<xml_diff>
--- a/Algorithms/FirstLab/Отчёт1.docx
+++ b/Algorithms/FirstLab/Отчёт1.docx
@@ -5294,14 +5294,42 @@
           <w:color w:val="1B1C1D"/>
           <w:lang w:val="ru-RU"/>
         </w:rPr>
-        <w:t>Подготовка файлов</w:t>
-      </w:r>
-      <w:r>
-        <w:rPr>
-          <w:color w:val="1B1C1D"/>
-          <w:lang w:val="ru-RU"/>
-        </w:rPr>
-        <w:t>: Убедитесь, что файлы-словари (names.txt, cities.txt и т.д.) и файл с маршрутами поездов (train_routes.txt) находятся в той же директории, что и исполняемый файл.</w:t>
+        <w:t>Запуск</w:t>
+      </w:r>
+      <w:r>
+        <w:rPr>
+          <w:color w:val="1B1C1D"/>
+          <w:lang w:val="ru-RU"/>
+        </w:rPr>
+        <w:t xml:space="preserve">: Запустите </w:t>
+      </w:r>
+      <w:r>
+        <w:rPr>
+          <w:color w:val="1B1C1D"/>
+          <w:lang w:val="ru-RU"/>
+        </w:rPr>
+        <w:t xml:space="preserve">файл </w:t>
+      </w:r>
+      <w:r>
+        <w:rPr>
+          <w:color w:val="1B1C1D"/>
+          <w:lang w:val="en-US"/>
+        </w:rPr>
+        <w:t>run</w:t>
+      </w:r>
+      <w:r>
+        <w:rPr>
+          <w:color w:val="1B1C1D"/>
+          <w:lang w:val="ru-RU"/>
+        </w:rPr>
+        <w:t>.</w:t>
+      </w:r>
+      <w:r>
+        <w:rPr>
+          <w:color w:val="1B1C1D"/>
+          <w:lang w:val="en-US"/>
+        </w:rPr>
+        <w:t>bat</w:t>
       </w:r>
     </w:p>
     <w:p>
@@ -5325,65 +5353,6 @@
           <w:color w:val="1B1C1D"/>
           <w:lang w:val="ru-RU"/>
         </w:rPr>
-        <w:t>Запуск</w:t>
-      </w:r>
-      <w:r>
-        <w:rPr>
-          <w:color w:val="1B1C1D"/>
-          <w:lang w:val="ru-RU"/>
-        </w:rPr>
-        <w:t xml:space="preserve">: Запустите </w:t>
-      </w:r>
-      <w:r>
-        <w:rPr>
-          <w:color w:val="1B1C1D"/>
-          <w:lang w:val="ru-RU"/>
-        </w:rPr>
-        <w:t xml:space="preserve">файл </w:t>
-      </w:r>
-      <w:r>
-        <w:rPr>
-          <w:color w:val="1B1C1D"/>
-          <w:lang w:val="en-US"/>
-        </w:rPr>
-        <w:t>run</w:t>
-      </w:r>
-      <w:r>
-        <w:rPr>
-          <w:color w:val="1B1C1D"/>
-          <w:lang w:val="ru-RU"/>
-        </w:rPr>
-        <w:t>.</w:t>
-      </w:r>
-      <w:r>
-        <w:rPr>
-          <w:color w:val="1B1C1D"/>
-          <w:lang w:val="en-US"/>
-        </w:rPr>
-        <w:t>bat</w:t>
-      </w:r>
-    </w:p>
-    <w:p>
-      <w:pPr>
-        <w:numPr>
-          <w:ilvl w:val="0"/>
-          <w:numId w:val="14"/>
-        </w:numPr>
-        <w:spacing w:line="240" w:lineRule="auto"/>
-        <w:ind w:left="480"/>
-        <w:textAlignment w:val="baseline"/>
-        <w:rPr>
-          <w:color w:val="000000"/>
-          <w:lang w:val="ru-RU"/>
-        </w:rPr>
-      </w:pPr>
-      <w:r>
-        <w:rPr>
-          <w:b/>
-          <w:bCs/>
-          <w:color w:val="1B1C1D"/>
-          <w:lang w:val="ru-RU"/>
-        </w:rPr>
         <w:t>Ввод параметров</w:t>
       </w:r>
       <w:r>
@@ -5515,17 +5484,8 @@
           <w:color w:val="1B1C1D"/>
           <w:lang w:val="ru-RU"/>
         </w:rPr>
-        <w:t xml:space="preserve"> </w:t>
-      </w:r>
-      <w:r>
-        <w:rPr>
-          <w:color w:val="1B1C1D"/>
-          <w:lang w:val="ru-RU"/>
-        </w:rPr>
-        <w:t>Программа принимает на вход только натуральные числа, написанные цифрами</w:t>
-      </w:r>
-      <w:bookmarkStart w:id="9" w:name="_GoBack"/>
-      <w:bookmarkEnd w:id="9"/>
+        <w:t xml:space="preserve"> Программа принимает на вход только натуральные числа, написанные цифрами</w:t>
+      </w:r>
     </w:p>
     <w:p>
       <w:pPr>
@@ -5613,7 +5573,7 @@
           <w:szCs w:val="28"/>
         </w:rPr>
       </w:pPr>
-      <w:bookmarkStart w:id="10" w:name="_Toc213318234"/>
+      <w:bookmarkStart w:id="9" w:name="_Toc213318234"/>
       <w:r>
         <w:rPr>
           <w:b/>
@@ -5622,7 +5582,7 @@
         </w:rPr>
         <w:t>Рекомендации программиста</w:t>
       </w:r>
-      <w:bookmarkEnd w:id="10"/>
+      <w:bookmarkEnd w:id="9"/>
     </w:p>
     <w:p>
       <w:pPr>
@@ -5641,7 +5601,29 @@
           <w:sz w:val="28"/>
           <w:szCs w:val="28"/>
         </w:rPr>
-        <w:t>Для обеспечения корректной работы и удобства модернизации программы следует учесть:</w:t>
+        <w:t xml:space="preserve">Программа написана на языке </w:t>
+      </w:r>
+      <w:r>
+        <w:rPr>
+          <w:sz w:val="28"/>
+          <w:szCs w:val="28"/>
+          <w:lang w:val="en-US"/>
+        </w:rPr>
+        <w:t>C</w:t>
+      </w:r>
+      <w:r>
+        <w:rPr>
+          <w:sz w:val="28"/>
+          <w:szCs w:val="28"/>
+        </w:rPr>
+        <w:t xml:space="preserve">++ </w:t>
+      </w:r>
+      <w:r>
+        <w:rPr>
+          <w:sz w:val="28"/>
+          <w:szCs w:val="28"/>
+        </w:rPr>
+        <w:t>рекомендуется использовать компилятор самой последней версии</w:t>
       </w:r>
     </w:p>
     <w:p>
@@ -5662,133 +5644,28 @@
           <w:sz w:val="28"/>
           <w:szCs w:val="28"/>
         </w:rPr>
-        <w:t>Требования к среде</w:t>
+        <w:t>Входные данные</w:t>
       </w:r>
       <w:r>
         <w:rPr>
           <w:sz w:val="28"/>
           <w:szCs w:val="28"/>
         </w:rPr>
-        <w:t xml:space="preserve">: Для компиляции и корректной работы программы рекомендуется использовать компилятор </w:t>
-      </w:r>
-      <w:r>
-        <w:rPr>
-          <w:rStyle w:val="ad"/>
+        <w:t>: Убедитесь, что все не</w:t>
+      </w:r>
+      <w:r>
+        <w:rPr>
           <w:sz w:val="28"/>
           <w:szCs w:val="28"/>
         </w:rPr>
-        <w:t>GCC</w:t>
+        <w:t>обходимые входные файлы-словари находятся в директории запуска, их отсутствие приведёт к ошибке запуска программы</w:t>
       </w:r>
       <w:r>
         <w:rPr>
           <w:sz w:val="28"/>
           <w:szCs w:val="28"/>
         </w:rPr>
-        <w:t xml:space="preserve"> (версии 9.0 или выше) или </w:t>
-      </w:r>
-      <w:proofErr w:type="spellStart"/>
-      <w:r>
-        <w:rPr>
-          <w:rStyle w:val="ad"/>
-          <w:sz w:val="28"/>
-          <w:szCs w:val="28"/>
-        </w:rPr>
-        <w:t>Clang</w:t>
-      </w:r>
-      <w:proofErr w:type="spellEnd"/>
-      <w:r>
-        <w:rPr>
-          <w:sz w:val="28"/>
-          <w:szCs w:val="28"/>
-        </w:rPr>
-        <w:t xml:space="preserve">, поддерживающий стандарт </w:t>
-      </w:r>
-      <w:r>
-        <w:rPr>
-          <w:rStyle w:val="ad"/>
-          <w:sz w:val="28"/>
-          <w:szCs w:val="28"/>
-        </w:rPr>
-        <w:t>C++17</w:t>
-      </w:r>
-      <w:r>
-        <w:rPr>
-          <w:sz w:val="28"/>
-          <w:szCs w:val="28"/>
-        </w:rPr>
-        <w:t xml:space="preserve"> или более поздний. Стандартные библиотеки C++ (такие как </w:t>
-      </w:r>
-      <w:proofErr w:type="spellStart"/>
-      <w:r>
-        <w:rPr>
-          <w:rStyle w:val="HTML"/>
-          <w:rFonts w:ascii="Times New Roman" w:hAnsi="Times New Roman" w:cs="Times New Roman"/>
-          <w:sz w:val="28"/>
-          <w:szCs w:val="28"/>
-        </w:rPr>
-        <w:t>iostream</w:t>
-      </w:r>
-      <w:proofErr w:type="spellEnd"/>
-      <w:r>
-        <w:rPr>
-          <w:sz w:val="28"/>
-          <w:szCs w:val="28"/>
-        </w:rPr>
-        <w:t xml:space="preserve">, </w:t>
-      </w:r>
-      <w:proofErr w:type="spellStart"/>
-      <w:r>
-        <w:rPr>
-          <w:rStyle w:val="HTML"/>
-          <w:rFonts w:ascii="Times New Roman" w:hAnsi="Times New Roman" w:cs="Times New Roman"/>
-          <w:sz w:val="28"/>
-          <w:szCs w:val="28"/>
-        </w:rPr>
-        <w:t>fstream</w:t>
-      </w:r>
-      <w:proofErr w:type="spellEnd"/>
-      <w:r>
-        <w:rPr>
-          <w:sz w:val="28"/>
-          <w:szCs w:val="28"/>
-        </w:rPr>
-        <w:t xml:space="preserve">, </w:t>
-      </w:r>
-      <w:proofErr w:type="spellStart"/>
-      <w:r>
-        <w:rPr>
-          <w:rStyle w:val="HTML"/>
-          <w:rFonts w:ascii="Times New Roman" w:hAnsi="Times New Roman" w:cs="Times New Roman"/>
-          <w:sz w:val="28"/>
-          <w:szCs w:val="28"/>
-        </w:rPr>
-        <w:t>map</w:t>
-      </w:r>
-      <w:proofErr w:type="spellEnd"/>
-      <w:r>
-        <w:rPr>
-          <w:sz w:val="28"/>
-          <w:szCs w:val="28"/>
-        </w:rPr>
-        <w:t xml:space="preserve">, </w:t>
-      </w:r>
-      <w:proofErr w:type="spellStart"/>
-      <w:r>
-        <w:rPr>
-          <w:rStyle w:val="HTML"/>
-          <w:rFonts w:ascii="Times New Roman" w:hAnsi="Times New Roman" w:cs="Times New Roman"/>
-          <w:sz w:val="28"/>
-          <w:szCs w:val="28"/>
-        </w:rPr>
-        <w:t>set</w:t>
-      </w:r>
-      <w:proofErr w:type="spellEnd"/>
-      <w:r>
-        <w:rPr>
-          <w:sz w:val="28"/>
-          <w:szCs w:val="28"/>
-        </w:rPr>
-        <w:t>) входят в базовую поставку компилятора.</w:t>
+        <w:t>.</w:t>
       </w:r>
     </w:p>
     <w:p>
@@ -5809,15 +5686,157 @@
           <w:sz w:val="28"/>
           <w:szCs w:val="28"/>
         </w:rPr>
-        <w:lastRenderedPageBreak/>
-        <w:t>Входные данные</w:t>
+        <w:t>Кодировка</w:t>
       </w:r>
       <w:r>
         <w:rPr>
           <w:sz w:val="28"/>
           <w:szCs w:val="28"/>
         </w:rPr>
-        <w:t>: Убедитесь, что все необходимые входные файлы-словари доступны в директории запуска. Отсутствие или некорректный формат этих файлов приведет к ошибкам ввода-вывода или неверной генерации данных.</w:t>
+        <w:t xml:space="preserve">: Программа использует </w:t>
+      </w:r>
+      <w:proofErr w:type="spellStart"/>
+      <w:r>
+        <w:rPr>
+          <w:rStyle w:val="HTML"/>
+          <w:rFonts w:ascii="Times New Roman" w:hAnsi="Times New Roman" w:cs="Times New Roman"/>
+          <w:sz w:val="28"/>
+          <w:szCs w:val="28"/>
+        </w:rPr>
+        <w:t>const</w:t>
+      </w:r>
+      <w:proofErr w:type="spellEnd"/>
+      <w:r>
+        <w:rPr>
+          <w:rStyle w:val="HTML"/>
+          <w:rFonts w:ascii="Times New Roman" w:hAnsi="Times New Roman" w:cs="Times New Roman"/>
+          <w:sz w:val="28"/>
+          <w:szCs w:val="28"/>
+        </w:rPr>
+        <w:t xml:space="preserve"> </w:t>
+      </w:r>
+      <w:proofErr w:type="spellStart"/>
+      <w:r>
+        <w:rPr>
+          <w:rStyle w:val="HTML"/>
+          <w:rFonts w:ascii="Times New Roman" w:hAnsi="Times New Roman" w:cs="Times New Roman"/>
+          <w:sz w:val="28"/>
+          <w:szCs w:val="28"/>
+        </w:rPr>
+        <w:t>char</w:t>
+      </w:r>
+      <w:proofErr w:type="spellEnd"/>
+      <w:r>
+        <w:rPr>
+          <w:rStyle w:val="HTML"/>
+          <w:rFonts w:ascii="Times New Roman" w:hAnsi="Times New Roman" w:cs="Times New Roman"/>
+          <w:sz w:val="28"/>
+          <w:szCs w:val="28"/>
+        </w:rPr>
+        <w:t xml:space="preserve"> UTF8_</w:t>
+      </w:r>
+      <w:proofErr w:type="gramStart"/>
+      <w:r>
+        <w:rPr>
+          <w:rStyle w:val="HTML"/>
+          <w:rFonts w:ascii="Times New Roman" w:hAnsi="Times New Roman" w:cs="Times New Roman"/>
+          <w:sz w:val="28"/>
+          <w:szCs w:val="28"/>
+        </w:rPr>
+        <w:t>BOM[</w:t>
+      </w:r>
+      <w:proofErr w:type="gramEnd"/>
+      <w:r>
+        <w:rPr>
+          <w:rStyle w:val="HTML"/>
+          <w:rFonts w:ascii="Times New Roman" w:hAnsi="Times New Roman" w:cs="Times New Roman"/>
+          <w:sz w:val="28"/>
+          <w:szCs w:val="28"/>
+        </w:rPr>
+        <w:t>] = "\</w:t>
+      </w:r>
+      <w:proofErr w:type="spellStart"/>
+      <w:r>
+        <w:rPr>
+          <w:rStyle w:val="HTML"/>
+          <w:rFonts w:ascii="Times New Roman" w:hAnsi="Times New Roman" w:cs="Times New Roman"/>
+          <w:sz w:val="28"/>
+          <w:szCs w:val="28"/>
+        </w:rPr>
+        <w:t>xEF</w:t>
+      </w:r>
+      <w:proofErr w:type="spellEnd"/>
+      <w:r>
+        <w:rPr>
+          <w:rStyle w:val="HTML"/>
+          <w:rFonts w:ascii="Times New Roman" w:hAnsi="Times New Roman" w:cs="Times New Roman"/>
+          <w:sz w:val="28"/>
+          <w:szCs w:val="28"/>
+        </w:rPr>
+        <w:t>\</w:t>
+      </w:r>
+      <w:proofErr w:type="spellStart"/>
+      <w:r>
+        <w:rPr>
+          <w:rStyle w:val="HTML"/>
+          <w:rFonts w:ascii="Times New Roman" w:hAnsi="Times New Roman" w:cs="Times New Roman"/>
+          <w:sz w:val="28"/>
+          <w:szCs w:val="28"/>
+        </w:rPr>
+        <w:t>xBB</w:t>
+      </w:r>
+      <w:proofErr w:type="spellEnd"/>
+      <w:r>
+        <w:rPr>
+          <w:rStyle w:val="HTML"/>
+          <w:rFonts w:ascii="Times New Roman" w:hAnsi="Times New Roman" w:cs="Times New Roman"/>
+          <w:sz w:val="28"/>
+          <w:szCs w:val="28"/>
+        </w:rPr>
+        <w:t>\</w:t>
+      </w:r>
+      <w:proofErr w:type="spellStart"/>
+      <w:r>
+        <w:rPr>
+          <w:rStyle w:val="HTML"/>
+          <w:rFonts w:ascii="Times New Roman" w:hAnsi="Times New Roman" w:cs="Times New Roman"/>
+          <w:sz w:val="28"/>
+          <w:szCs w:val="28"/>
+        </w:rPr>
+        <w:t>xBF</w:t>
+      </w:r>
+      <w:proofErr w:type="spellEnd"/>
+      <w:r>
+        <w:rPr>
+          <w:rStyle w:val="HTML"/>
+          <w:rFonts w:ascii="Times New Roman" w:hAnsi="Times New Roman" w:cs="Times New Roman"/>
+          <w:sz w:val="28"/>
+          <w:szCs w:val="28"/>
+        </w:rPr>
+        <w:t>";</w:t>
+      </w:r>
+      <w:r>
+        <w:rPr>
+          <w:sz w:val="28"/>
+          <w:szCs w:val="28"/>
+        </w:rPr>
+        <w:t xml:space="preserve"> при записи в файл для корректного отображения кириллицы в CSV-файлах (например, в </w:t>
+      </w:r>
+      <w:proofErr w:type="spellStart"/>
+      <w:r>
+        <w:rPr>
+          <w:sz w:val="28"/>
+          <w:szCs w:val="28"/>
+        </w:rPr>
+        <w:t>Excel</w:t>
+      </w:r>
+      <w:proofErr w:type="spellEnd"/>
+      <w:r>
+        <w:rPr>
+          <w:sz w:val="28"/>
+          <w:szCs w:val="28"/>
+        </w:rPr>
+        <w:t>). При изменении способа записи файла необходимо сохранить этот префикс.</w:t>
       </w:r>
     </w:p>
     <w:p>
@@ -5838,279 +5857,31 @@
           <w:sz w:val="28"/>
           <w:szCs w:val="28"/>
         </w:rPr>
-        <w:t>Кодировка</w:t>
+        <w:lastRenderedPageBreak/>
+        <w:t>Словари</w:t>
       </w:r>
       <w:r>
         <w:rPr>
           <w:sz w:val="28"/>
           <w:szCs w:val="28"/>
         </w:rPr>
-        <w:t xml:space="preserve">: Программа использует </w:t>
+        <w:t xml:space="preserve">: Для расширения </w:t>
       </w:r>
       <w:proofErr w:type="spellStart"/>
       <w:r>
         <w:rPr>
-          <w:rStyle w:val="HTML"/>
-          <w:rFonts w:ascii="Times New Roman" w:hAnsi="Times New Roman" w:cs="Times New Roman"/>
           <w:sz w:val="28"/>
           <w:szCs w:val="28"/>
         </w:rPr>
-        <w:t>const</w:t>
+        <w:t>датасета</w:t>
       </w:r>
       <w:proofErr w:type="spellEnd"/>
       <w:r>
         <w:rPr>
-          <w:rStyle w:val="HTML"/>
-          <w:rFonts w:ascii="Times New Roman" w:hAnsi="Times New Roman" w:cs="Times New Roman"/>
           <w:sz w:val="28"/>
           <w:szCs w:val="28"/>
         </w:rPr>
-        <w:t xml:space="preserve"> </w:t>
-      </w:r>
-      <w:proofErr w:type="spellStart"/>
-      <w:r>
-        <w:rPr>
-          <w:rStyle w:val="HTML"/>
-          <w:rFonts w:ascii="Times New Roman" w:hAnsi="Times New Roman" w:cs="Times New Roman"/>
-          <w:sz w:val="28"/>
-          <w:szCs w:val="28"/>
-        </w:rPr>
-        <w:t>char</w:t>
-      </w:r>
-      <w:proofErr w:type="spellEnd"/>
-      <w:r>
-        <w:rPr>
-          <w:rStyle w:val="HTML"/>
-          <w:rFonts w:ascii="Times New Roman" w:hAnsi="Times New Roman" w:cs="Times New Roman"/>
-          <w:sz w:val="28"/>
-          <w:szCs w:val="28"/>
-        </w:rPr>
-        <w:t xml:space="preserve"> UTF8_</w:t>
-      </w:r>
-      <w:proofErr w:type="gramStart"/>
-      <w:r>
-        <w:rPr>
-          <w:rStyle w:val="HTML"/>
-          <w:rFonts w:ascii="Times New Roman" w:hAnsi="Times New Roman" w:cs="Times New Roman"/>
-          <w:sz w:val="28"/>
-          <w:szCs w:val="28"/>
-        </w:rPr>
-        <w:t>BOM[</w:t>
-      </w:r>
-      <w:proofErr w:type="gramEnd"/>
-      <w:r>
-        <w:rPr>
-          <w:rStyle w:val="HTML"/>
-          <w:rFonts w:ascii="Times New Roman" w:hAnsi="Times New Roman" w:cs="Times New Roman"/>
-          <w:sz w:val="28"/>
-          <w:szCs w:val="28"/>
-        </w:rPr>
-        <w:t>] = "\</w:t>
-      </w:r>
-      <w:proofErr w:type="spellStart"/>
-      <w:r>
-        <w:rPr>
-          <w:rStyle w:val="HTML"/>
-          <w:rFonts w:ascii="Times New Roman" w:hAnsi="Times New Roman" w:cs="Times New Roman"/>
-          <w:sz w:val="28"/>
-          <w:szCs w:val="28"/>
-        </w:rPr>
-        <w:t>xEF</w:t>
-      </w:r>
-      <w:proofErr w:type="spellEnd"/>
-      <w:r>
-        <w:rPr>
-          <w:rStyle w:val="HTML"/>
-          <w:rFonts w:ascii="Times New Roman" w:hAnsi="Times New Roman" w:cs="Times New Roman"/>
-          <w:sz w:val="28"/>
-          <w:szCs w:val="28"/>
-        </w:rPr>
-        <w:t>\</w:t>
-      </w:r>
-      <w:proofErr w:type="spellStart"/>
-      <w:r>
-        <w:rPr>
-          <w:rStyle w:val="HTML"/>
-          <w:rFonts w:ascii="Times New Roman" w:hAnsi="Times New Roman" w:cs="Times New Roman"/>
-          <w:sz w:val="28"/>
-          <w:szCs w:val="28"/>
-        </w:rPr>
-        <w:t>xBB</w:t>
-      </w:r>
-      <w:proofErr w:type="spellEnd"/>
-      <w:r>
-        <w:rPr>
-          <w:rStyle w:val="HTML"/>
-          <w:rFonts w:ascii="Times New Roman" w:hAnsi="Times New Roman" w:cs="Times New Roman"/>
-          <w:sz w:val="28"/>
-          <w:szCs w:val="28"/>
-        </w:rPr>
-        <w:t>\</w:t>
-      </w:r>
-      <w:proofErr w:type="spellStart"/>
-      <w:r>
-        <w:rPr>
-          <w:rStyle w:val="HTML"/>
-          <w:rFonts w:ascii="Times New Roman" w:hAnsi="Times New Roman" w:cs="Times New Roman"/>
-          <w:sz w:val="28"/>
-          <w:szCs w:val="28"/>
-        </w:rPr>
-        <w:t>xBF</w:t>
-      </w:r>
-      <w:proofErr w:type="spellEnd"/>
-      <w:r>
-        <w:rPr>
-          <w:rStyle w:val="HTML"/>
-          <w:rFonts w:ascii="Times New Roman" w:hAnsi="Times New Roman" w:cs="Times New Roman"/>
-          <w:sz w:val="28"/>
-          <w:szCs w:val="28"/>
-        </w:rPr>
-        <w:t>";</w:t>
-      </w:r>
-      <w:r>
-        <w:rPr>
-          <w:sz w:val="28"/>
-          <w:szCs w:val="28"/>
-        </w:rPr>
-        <w:t xml:space="preserve"> при записи в файл для корректного отображения кириллицы в CSV-файлах (например, в </w:t>
-      </w:r>
-      <w:proofErr w:type="spellStart"/>
-      <w:r>
-        <w:rPr>
-          <w:sz w:val="28"/>
-          <w:szCs w:val="28"/>
-        </w:rPr>
-        <w:t>Excel</w:t>
-      </w:r>
-      <w:proofErr w:type="spellEnd"/>
-      <w:r>
-        <w:rPr>
-          <w:sz w:val="28"/>
-          <w:szCs w:val="28"/>
-        </w:rPr>
-        <w:t>). При изменении способа записи файла необходимо сохранить этот префикс.</w:t>
-      </w:r>
-    </w:p>
-    <w:p>
-      <w:pPr>
-        <w:pStyle w:val="ac"/>
-        <w:numPr>
-          <w:ilvl w:val="0"/>
-          <w:numId w:val="20"/>
-        </w:numPr>
-        <w:rPr>
-          <w:sz w:val="28"/>
-          <w:szCs w:val="28"/>
-        </w:rPr>
-      </w:pPr>
-      <w:r>
-        <w:rPr>
-          <w:rStyle w:val="ad"/>
-          <w:sz w:val="28"/>
-          <w:szCs w:val="28"/>
-        </w:rPr>
-        <w:t>Словари</w:t>
-      </w:r>
-      <w:r>
-        <w:rPr>
-          <w:sz w:val="28"/>
-          <w:szCs w:val="28"/>
-        </w:rPr>
-        <w:t xml:space="preserve">: Для расширения </w:t>
-      </w:r>
-      <w:proofErr w:type="spellStart"/>
-      <w:r>
-        <w:rPr>
-          <w:sz w:val="28"/>
-          <w:szCs w:val="28"/>
-        </w:rPr>
-        <w:t>датасета</w:t>
-      </w:r>
-      <w:proofErr w:type="spellEnd"/>
-      <w:r>
-        <w:rPr>
-          <w:sz w:val="28"/>
-          <w:szCs w:val="28"/>
-        </w:rPr>
         <w:t xml:space="preserve"> (добавления новых ФИО, городов, маршрутов) достаточно редактировать соответствующие текстовые файлы.</w:t>
-      </w:r>
-    </w:p>
-    <w:p>
-      <w:pPr>
-        <w:pStyle w:val="ac"/>
-        <w:numPr>
-          <w:ilvl w:val="0"/>
-          <w:numId w:val="20"/>
-        </w:numPr>
-        <w:rPr>
-          <w:sz w:val="28"/>
-          <w:szCs w:val="28"/>
-        </w:rPr>
-      </w:pPr>
-      <w:r>
-        <w:rPr>
-          <w:rStyle w:val="ad"/>
-          <w:sz w:val="28"/>
-          <w:szCs w:val="28"/>
-        </w:rPr>
-        <w:t>Расчет стоимости</w:t>
-      </w:r>
-      <w:r>
-        <w:rPr>
-          <w:sz w:val="28"/>
-          <w:szCs w:val="28"/>
-        </w:rPr>
-        <w:t xml:space="preserve">: Логика расчета стоимости находится в </w:t>
-      </w:r>
-      <w:r>
-        <w:rPr>
-          <w:rStyle w:val="HTML"/>
-          <w:rFonts w:ascii="Times New Roman" w:hAnsi="Times New Roman" w:cs="Times New Roman"/>
-          <w:sz w:val="28"/>
-          <w:szCs w:val="28"/>
-        </w:rPr>
-        <w:t>main.cpp</w:t>
-      </w:r>
-      <w:r>
-        <w:rPr>
-          <w:sz w:val="28"/>
-          <w:szCs w:val="28"/>
-        </w:rPr>
-        <w:t xml:space="preserve"> и основана на тарифах (</w:t>
-      </w:r>
-      <w:proofErr w:type="spellStart"/>
-      <w:r>
-        <w:rPr>
-          <w:sz w:val="28"/>
-          <w:szCs w:val="28"/>
-        </w:rPr>
-        <w:t>руб</w:t>
-      </w:r>
-      <w:proofErr w:type="spellEnd"/>
-      <w:r>
-        <w:rPr>
-          <w:sz w:val="28"/>
-          <w:szCs w:val="28"/>
-        </w:rPr>
-        <w:t xml:space="preserve">/мин). Для изменения ценовой политики или добавления новых тарифов необходимо обновить структуру </w:t>
-      </w:r>
-      <w:proofErr w:type="spellStart"/>
-      <w:r>
-        <w:rPr>
-          <w:rStyle w:val="HTML"/>
-          <w:rFonts w:ascii="Times New Roman" w:hAnsi="Times New Roman" w:cs="Times New Roman"/>
-          <w:sz w:val="28"/>
-          <w:szCs w:val="28"/>
-        </w:rPr>
-        <w:t>allWagonPricesMap</w:t>
-      </w:r>
-      <w:proofErr w:type="spellEnd"/>
-      <w:r>
-        <w:rPr>
-          <w:sz w:val="28"/>
-          <w:szCs w:val="28"/>
-        </w:rPr>
-        <w:t xml:space="preserve"> и формулу расчета.</w:t>
       </w:r>
     </w:p>
     <w:p>
@@ -6129,7 +5900,7 @@
           <w:szCs w:val="28"/>
         </w:rPr>
       </w:pPr>
-      <w:bookmarkStart w:id="11" w:name="_Toc213318235"/>
+      <w:bookmarkStart w:id="10" w:name="_Toc213318235"/>
       <w:r>
         <w:rPr>
           <w:b/>
@@ -6138,30 +5909,44 @@
         </w:rPr>
         <w:t>Контрольный пример</w:t>
       </w:r>
-      <w:bookmarkEnd w:id="11"/>
-    </w:p>
-    <w:p>
-      <w:pPr>
-        <w:pStyle w:val="a9"/>
-        <w:numPr>
-          <w:ilvl w:val="0"/>
-          <w:numId w:val="21"/>
-        </w:numPr>
+      <w:bookmarkEnd w:id="10"/>
+    </w:p>
+    <w:p>
+      <w:pPr>
+        <w:ind w:left="360"/>
+        <w:rPr>
+          <w:lang w:val="ru-RU"/>
+        </w:rPr>
+      </w:pPr>
+      <w:r>
+        <w:rPr>
+          <w:lang w:val="ru-RU"/>
+        </w:rPr>
+        <w:t>Произведём з</w:t>
+      </w:r>
+      <w:r>
+        <w:rPr>
+          <w:lang w:val="ru-RU"/>
+        </w:rPr>
+        <w:t xml:space="preserve">апуск файла </w:t>
+      </w:r>
+      <w:r>
         <w:rPr>
           <w:lang w:val="en-US"/>
         </w:rPr>
-      </w:pPr>
-      <w:r>
-        <w:rPr>
-          <w:lang w:val="ru-RU"/>
-        </w:rPr>
-        <w:t xml:space="preserve">Запуск файла </w:t>
+        <w:t>run</w:t>
+      </w:r>
+      <w:r>
+        <w:rPr>
+          <w:lang w:val="ru-RU"/>
+        </w:rPr>
+        <w:t>.</w:t>
       </w:r>
       <w:r>
         <w:rPr>
           <w:lang w:val="en-US"/>
         </w:rPr>
-        <w:t>run.bat</w:t>
+        <w:t>bat</w:t>
       </w:r>
     </w:p>
     <w:p>
@@ -6220,10 +6005,7 @@
         </w:rPr>
       </w:pPr>
       <w:r>
-        <w:t>Рис. 9</w:t>
-      </w:r>
-      <w:r>
-        <w:t>.1</w:t>
+        <w:t>Рис. 9.1</w:t>
       </w:r>
       <w:r>
         <w:rPr>
@@ -6234,36 +6016,16 @@
     </w:p>
     <w:p>
       <w:pPr>
-        <w:pStyle w:val="a9"/>
-        <w:numPr>
-          <w:ilvl w:val="0"/>
-          <w:numId w:val="21"/>
-        </w:numPr>
-        <w:rPr>
-          <w:lang w:val="ru-RU"/>
-        </w:rPr>
-      </w:pPr>
-      <w:r>
-        <w:rPr>
-          <w:lang w:val="ru-RU"/>
-        </w:rPr>
-        <w:t xml:space="preserve">Ввод размера </w:t>
-      </w:r>
-      <w:proofErr w:type="spellStart"/>
-      <w:r>
-        <w:rPr>
-          <w:lang w:val="ru-RU"/>
-        </w:rPr>
-        <w:t>датасета</w:t>
-      </w:r>
-      <w:proofErr w:type="spellEnd"/>
-    </w:p>
-    <w:p>
-      <w:pPr>
-        <w:rPr>
-          <w:lang w:val="ru-RU"/>
-        </w:rPr>
-      </w:pPr>
+        <w:rPr>
+          <w:lang w:val="ru-RU"/>
+        </w:rPr>
+      </w:pPr>
+      <w:r>
+        <w:rPr>
+          <w:lang w:val="ru-RU"/>
+        </w:rPr>
+        <w:t xml:space="preserve">Откроется командная строка, которая запросит ввод размера массива </w:t>
+      </w:r>
       <w:r>
         <w:rPr>
           <w:noProof/>
@@ -6314,28 +6076,13 @@
         </w:rPr>
       </w:pPr>
       <w:r>
-        <w:t>Рис. 9</w:t>
-      </w:r>
-      <w:r>
-        <w:t>.</w:t>
-      </w:r>
-      <w:r>
-        <w:rPr>
-          <w:lang w:val="ru-RU"/>
-        </w:rPr>
-        <w:t>2</w:t>
-      </w:r>
-      <w:r>
-        <w:rPr>
-          <w:lang w:val="ru-RU"/>
-        </w:rPr>
-        <w:t xml:space="preserve"> </w:t>
-      </w:r>
-      <w:r>
-        <w:rPr>
-          <w:lang w:val="ru-RU"/>
-        </w:rPr>
-        <w:t xml:space="preserve">Ввод длины </w:t>
+        <w:t>Рис. 9.</w:t>
+      </w:r>
+      <w:r>
+        <w:rPr>
+          <w:lang w:val="ru-RU"/>
+        </w:rPr>
+        <w:t xml:space="preserve">2 Ввод длины </w:t>
       </w:r>
       <w:proofErr w:type="spellStart"/>
       <w:r>
@@ -6356,20 +6103,15 @@
     <w:p>
       <w:pPr>
         <w:pStyle w:val="a9"/>
-        <w:numPr>
-          <w:ilvl w:val="0"/>
-          <w:numId w:val="21"/>
-        </w:numPr>
-        <w:rPr>
-          <w:lang w:val="ru-RU"/>
-        </w:rPr>
-      </w:pPr>
-      <w:r>
-        <w:rPr>
-          <w:lang w:val="ru-RU"/>
-        </w:rPr>
-        <w:lastRenderedPageBreak/>
-        <w:t>Ввод вероятности</w:t>
+        <w:rPr>
+          <w:lang w:val="ru-RU"/>
+        </w:rPr>
+      </w:pPr>
+      <w:r>
+        <w:rPr>
+          <w:lang w:val="ru-RU"/>
+        </w:rPr>
+        <w:t>Затем введём доли вероятности выпадения той или иной карты</w:t>
       </w:r>
       <w:r>
         <w:rPr>
@@ -6416,10 +6158,32 @@
     <w:p>
       <w:pPr>
         <w:pStyle w:val="a9"/>
-        <w:numPr>
-          <w:ilvl w:val="0"/>
-          <w:numId w:val="21"/>
-        </w:numPr>
+        <w:jc w:val="center"/>
+        <w:rPr>
+          <w:lang w:val="ru-RU"/>
+        </w:rPr>
+      </w:pPr>
+      <w:r>
+        <w:t>Рис. 9.</w:t>
+      </w:r>
+      <w:r>
+        <w:rPr>
+          <w:lang w:val="ru-RU"/>
+        </w:rPr>
+        <w:t>3 Ввод вероятности карт</w:t>
+      </w:r>
+    </w:p>
+    <w:p>
+      <w:pPr>
+        <w:pStyle w:val="a9"/>
+        <w:rPr>
+          <w:lang w:val="ru-RU"/>
+        </w:rPr>
+      </w:pPr>
+    </w:p>
+    <w:p>
+      <w:pPr>
+        <w:pStyle w:val="a9"/>
         <w:rPr>
           <w:lang w:val="ru-RU"/>
         </w:rPr>
@@ -6442,10 +6206,11 @@
           <w:noProof/>
           <w:lang w:val="ru-RU"/>
         </w:rPr>
+        <w:lastRenderedPageBreak/>
         <w:drawing>
           <wp:inline distT="0" distB="0" distL="0" distR="0" wp14:anchorId="7C802D63" wp14:editId="5C5A2A25">
-            <wp:extent cx="5733415" cy="2413635"/>
-            <wp:effectExtent l="0" t="0" r="635" b="5715"/>
+            <wp:extent cx="4932436" cy="2076442"/>
+            <wp:effectExtent l="0" t="0" r="1905" b="635"/>
             <wp:docPr id="9" name="Рисунок 9"/>
             <wp:cNvGraphicFramePr>
               <a:graphicFrameLocks xmlns:a="http://schemas.openxmlformats.org/drawingml/2006/main" noChangeAspect="1"/>
@@ -6466,7 +6231,7 @@
                   <pic:spPr>
                     <a:xfrm>
                       <a:off x="0" y="0"/>
-                      <a:ext cx="5733415" cy="2413635"/>
+                      <a:ext cx="4953688" cy="2085389"/>
                     </a:xfrm>
                     <a:prstGeom prst="rect">
                       <a:avLst/>
@@ -6481,21 +6246,43 @@
     </w:p>
     <w:p>
       <w:pPr>
+        <w:jc w:val="center"/>
+        <w:rPr>
+          <w:lang w:val="ru-RU"/>
+        </w:rPr>
+      </w:pPr>
+      <w:r>
+        <w:t>Рис. 9.</w:t>
+      </w:r>
+      <w:r>
+        <w:rPr>
+          <w:lang w:val="ru-RU"/>
+        </w:rPr>
+        <w:t>4 Папка с результатом</w:t>
+      </w:r>
+    </w:p>
+    <w:p>
+      <w:pPr>
+        <w:rPr>
+          <w:lang w:val="ru-RU"/>
+        </w:rPr>
+      </w:pPr>
+    </w:p>
+    <w:p>
+      <w:pPr>
         <w:pStyle w:val="a9"/>
-        <w:numPr>
-          <w:ilvl w:val="0"/>
-          <w:numId w:val="21"/>
-        </w:numPr>
-        <w:rPr>
-          <w:lang w:val="ru-RU"/>
-        </w:rPr>
-      </w:pPr>
-      <w:r>
-        <w:rPr>
-          <w:lang w:val="ru-RU"/>
-        </w:rPr>
-        <w:t>Результат</w:t>
-      </w:r>
+        <w:rPr>
+          <w:lang w:val="ru-RU"/>
+        </w:rPr>
+      </w:pPr>
+      <w:r>
+        <w:rPr>
+          <w:lang w:val="ru-RU"/>
+        </w:rPr>
+        <w:t>Откроем его и убедимся, что всё сгенерировано коррректно</w:t>
+      </w:r>
+      <w:bookmarkStart w:id="11" w:name="_GoBack"/>
+      <w:bookmarkEnd w:id="11"/>
     </w:p>
     <w:p>
       <w:pPr>
@@ -6512,8 +6299,8 @@
         </w:rPr>
         <w:drawing>
           <wp:inline distT="0" distB="0" distL="0" distR="0" wp14:anchorId="0A0FBEF6" wp14:editId="191D9DF7">
-            <wp:extent cx="5733415" cy="3048000"/>
-            <wp:effectExtent l="0" t="0" r="635" b="0"/>
+            <wp:extent cx="5562600" cy="2957191"/>
+            <wp:effectExtent l="0" t="0" r="0" b="0"/>
             <wp:docPr id="8" name="Рисунок 8"/>
             <wp:cNvGraphicFramePr>
               <a:graphicFrameLocks xmlns:a="http://schemas.openxmlformats.org/drawingml/2006/main" noChangeAspect="1"/>
@@ -6534,7 +6321,7 @@
                   <pic:spPr>
                     <a:xfrm>
                       <a:off x="0" y="0"/>
-                      <a:ext cx="5733415" cy="3048000"/>
+                      <a:ext cx="5587994" cy="2970691"/>
                     </a:xfrm>
                     <a:prstGeom prst="rect">
                       <a:avLst/>
@@ -6546,6 +6333,36 @@
           </wp:inline>
         </w:drawing>
       </w:r>
+      <w:bookmarkStart w:id="12" w:name="_Toc213318236"/>
+    </w:p>
+    <w:p>
+      <w:pPr>
+        <w:jc w:val="center"/>
+        <w:rPr>
+          <w:lang w:val="ru-RU"/>
+        </w:rPr>
+      </w:pPr>
+      <w:r>
+        <w:t>Рис. 9.</w:t>
+      </w:r>
+      <w:r>
+        <w:rPr>
+          <w:lang w:val="ru-RU"/>
+        </w:rPr>
+        <w:t xml:space="preserve">5 Таблица </w:t>
+      </w:r>
+      <w:r>
+        <w:rPr>
+          <w:lang w:val="en-US"/>
+        </w:rPr>
+        <w:t>Excel</w:t>
+      </w:r>
+      <w:r>
+        <w:rPr>
+          <w:lang w:val="ru-RU"/>
+        </w:rPr>
+        <w:t xml:space="preserve"> </w:t>
+      </w:r>
     </w:p>
     <w:p>
       <w:pPr>
@@ -6561,7 +6378,6 @@
           <w:lang w:val="ru-RU"/>
         </w:rPr>
       </w:pPr>
-      <w:bookmarkStart w:id="12" w:name="_Toc213318236"/>
       <w:r>
         <w:rPr>
           <w:b/>
@@ -6594,7 +6410,6 @@
           <w:sz w:val="28"/>
           <w:szCs w:val="28"/>
         </w:rPr>
-        <w:lastRenderedPageBreak/>
         <w:t xml:space="preserve">В рамках данной лабораторной работы был разработан генератор синтетических данных на языке C++ для задачи "Покупка Ж/Д билета". Программа успешно реализует генерацию правдоподобных и структурно валидных записей, включая ФИО, паспортные данные, данные о поездке и уникальные номера банковских карт. Созданный генератор удовлетворяет техническому заданию и имеет высокую скорость работы, что позволяет генерировать большие </w:t>
       </w:r>
       <w:proofErr w:type="spellStart"/>
@@ -6613,13 +6428,6 @@
         </w:rPr>
         <w:t xml:space="preserve"> для дальнейшего использования в задачах анализа данных.</w:t>
       </w:r>
-    </w:p>
-    <w:p>
-      <w:pPr>
-        <w:rPr>
-          <w:lang w:val="ru-RU"/>
-        </w:rPr>
-      </w:pPr>
     </w:p>
     <w:sectPr>
       <w:pgSz w:w="11909" w:h="16834"/>
@@ -9537,7 +9345,7 @@
   </w:latentStyles>
   <w:style w:type="paragraph" w:default="1" w:styleId="a">
     <w:name w:val="Normal"/>
-    <w:rsid w:val="00C9316E"/>
+    <w:rsid w:val="004A3AD6"/>
   </w:style>
   <w:style w:type="paragraph" w:styleId="1">
     <w:name w:val="heading 1"/>
@@ -10195,7 +10003,7 @@
 </file>
 
 <file path=customXml/itemProps1.xml><?xml version="1.0" encoding="utf-8"?>
-<ds:datastoreItem xmlns:ds="http://schemas.openxmlformats.org/officeDocument/2006/customXml" ds:itemID="{C2B47958-EE92-4FBE-90DF-4CA85D4BC253}">
+<ds:datastoreItem xmlns:ds="http://schemas.openxmlformats.org/officeDocument/2006/customXml" ds:itemID="{41E4A24C-17AD-4F41-A629-9FA4599560DB}">
   <ds:schemaRefs>
     <ds:schemaRef ds:uri="http://schemas.openxmlformats.org/officeDocument/2006/bibliography"/>
   </ds:schemaRefs>

</xml_diff>